<commit_message>
confirms ruleset is up to date
</commit_message>
<xml_diff>
--- a/data-raw/grunID_final_run_assignment_ruleset.docx
+++ b/data-raw/grunID_final_run_assignment_ruleset.docx
@@ -424,7 +424,7 @@
       </w:r>
       <w:proofErr w:type="spellStart"/>
       <w:r>
-        <w:t>cv_winter</w:t>
+        <w:t>cv_spring</w:t>
       </w:r>
       <w:proofErr w:type="spellEnd"/>
       <w:r>
@@ -445,7 +445,7 @@
           <w:b/>
           <w:bCs/>
         </w:rPr>
-        <w:t>WINTER</w:t>
+        <w:t>SPRING</w:t>
       </w:r>
     </w:p>
     <w:p>
@@ -471,7 +471,7 @@
       </w:r>
       <w:proofErr w:type="spellStart"/>
       <w:r>
-        <w:t>cv_spring</w:t>
+        <w:t>cv_winter</w:t>
       </w:r>
       <w:proofErr w:type="spellEnd"/>
       <w:r>
@@ -492,7 +492,7 @@
           <w:b/>
           <w:bCs/>
         </w:rPr>
-        <w:t>SPRING</w:t>
+        <w:t>WINTER</w:t>
       </w:r>
     </w:p>
     <w:p>
@@ -1081,16 +1081,10 @@
       <w:pStyle w:val="Header"/>
     </w:pPr>
     <w:r>
-      <w:t>2025-1</w:t>
+      <w:t>2025-</w:t>
     </w:r>
     <w:r>
-      <w:t>-</w:t>
-    </w:r>
-    <w:r>
-      <w:t>2</w:t>
-    </w:r>
-    <w:r>
-      <w:t>7</w:t>
+      <w:t>3-3</w:t>
     </w:r>
   </w:p>
 </w:hdr>

</xml_diff>